<commit_message>
Caricamento password e programmi redazione fatture con e senza file
</commit_message>
<xml_diff>
--- a/static/uploads/bozzadinotula.docx
+++ b/static/uploads/bozzadinotula.docx
@@ -39,7 +39,7 @@
           <w:sz w:val="24"/>
           <w:szCs w:val="24"/>
         </w:rPr>
-        <w:t xml:space="preserve">hdfhrh</w:t>
+        <w:t xml:space="preserve">scadfAS</w:t>
       </w:r>
     </w:p>
     <w:p>
@@ -114,7 +114,7 @@
           <w:sz w:val="24"/>
           <w:szCs w:val="24"/>
         </w:rPr>
-        <w:t xml:space="preserve">hgrhwtr</w:t>
+        <w:t xml:space="preserve">FSDFsdf</w:t>
       </w:r>
     </w:p>
     <w:p>
@@ -189,7 +189,7 @@
           <w:sz w:val="24"/>
           <w:szCs w:val="24"/>
         </w:rPr>
-        <w:t xml:space="preserve">P.IVA - C.F htrhwtr</w:t>
+        <w:t xml:space="preserve">P.IVA - C.F fdsfsdfsd</w:t>
       </w:r>
     </w:p>
     <w:p>
@@ -282,7 +282,7 @@
         <w:rPr>
           <w:rFonts w:ascii="Garamond" w:hAnsi="Garamond"/>
         </w:rPr>
-        <w:t xml:space="preserve">htrhtrw</w:t>
+        <w:t xml:space="preserve">GEFGVFEF</w:t>
       </w:r>
       <w:r>
         <w:rPr>
@@ -306,7 +306,7 @@
         <w:rPr>
           <w:rFonts w:ascii="Garamond" w:hAnsi="Garamond"/>
         </w:rPr>
-        <w:t xml:space="preserve">htrhert</w:t>
+        <w:t xml:space="preserve">VFDVFEA</w:t>
       </w:r>
       <w:r>
         <w:rPr>
@@ -457,7 +457,7 @@
               <w:rPr>
                 <w:rFonts w:ascii="Garamond" w:hAnsi="Garamond"/>
               </w:rPr>
-              <w:t xml:space="preserve">htrhwrt</w:t>
+              <w:t xml:space="preserve">REFGRQEGRE</w:t>
             </w:r>
           </w:p>
           <w:p>
@@ -1306,7 +1306,7 @@
         <w:sz w:val="24"/>
         <w:szCs w:val="24"/>
       </w:rPr>
-      <w:t xml:space="preserve">htrhwtr</w:t>
+      <w:t xml:space="preserve">CDSVDFVFD</w:t>
     </w:r>
   </w:p>
   <w:p>
@@ -1325,7 +1325,7 @@
         <w:sz w:val="24"/>
         <w:szCs w:val="24"/>
       </w:rPr>
-      <w:t xml:space="preserve">htrhwtr</w:t>
+      <w:t xml:space="preserve">FDSFDASF</w:t>
     </w:r>
   </w:p>
   <w:p>
@@ -1368,7 +1368,7 @@
         <w:sz w:val="24"/>
         <w:szCs w:val="24"/>
       </w:rPr>
-      <w:t xml:space="preserve">htrhwtrh</w:t>
+      <w:t xml:space="preserve">VFDVDFVFDA</w:t>
     </w:r>
   </w:p>
   <w:p>

</xml_diff>